<commit_message>
Drop the Distill GitHub link, which would 404
The repo stays private, so the link is worse than no link: it reads as a
dead claim to anyone who clicks it. The portfolio site already omits it
for the same reason. The entry keeps its name, stack and year.

Still one page, 6.6pt spare. Ten hyperlinks remain, all pointing at
public targets.

Co-Authored-By: Claude Opus 5 <noreply@anthropic.com>
Claude-Session: https://claude.ai/code/session_01TZMtrvddzvMq5oVEMCKpau
</commit_message>
<xml_diff>
--- a/GautamSingh_Resume.docx
+++ b/GautamSingh_Resume.docx
@@ -594,7 +594,122 @@
         </w:rPr>
         <w:tab/>
       </w:r>
+      <w:r>
+        <w:rPr>
+          <w:rFonts w:eastAsia="Cambria" w:cs="Cambria"/>
+          <w:sz w:val="19"/>
+          <w:szCs w:val="19"/>
+          <w:i/>
+          <w:iCs/>
+        </w:rPr>
+        <w:t>2026</w:t>
+      </w:r>
+    </w:p>
+    <w:p>
+      <w:pPr>
+        <w:pStyle w:val="Normal"/>
+        <w:spacing w:before="0" w:after="10"/>
+        <w:rPr/>
+      </w:pPr>
+      <w:r>
+        <w:rPr>
+          <w:rFonts w:eastAsia="Cambria" w:cs="Cambria"/>
+          <w:sz w:val="19"/>
+          <w:szCs w:val="19"/>
+          <w:i/>
+          <w:iCs/>
+        </w:rPr>
+        <w:t>Python, PyTorch, Qwen2.5-VL, Transformers, Pydantic, FastAPI, Docker, GitHub Actions</w:t>
+      </w:r>
+    </w:p>
+    <w:p>
+      <w:pPr>
+        <w:pStyle w:val="ListParagraph"/>
+        <w:numPr>
+          <w:ilvl w:val="0"/>
+          <w:numId w:val="1"/>
+        </w:numPr>
+        <w:spacing w:lineRule="auto" w:line="230" w:before="10" w:after="10"/>
+        <w:rPr/>
+      </w:pPr>
+      <w:r>
+        <w:rPr>
+          <w:rFonts w:eastAsia="Cambria" w:cs="Cambria"/>
+          <w:sz w:val="19"/>
+          <w:szCs w:val="19"/>
+        </w:rPr>
+        <w:t>Built a local document extraction service that reads invoices and receipts into typed JSON and scores its own confidence on every field, lifting delivered accuracy from 80% to 97% by sending only the fields it does not trust to a human.</w:t>
+      </w:r>
+    </w:p>
+    <w:p>
+      <w:pPr>
+        <w:pStyle w:val="ListParagraph"/>
+        <w:numPr>
+          <w:ilvl w:val="0"/>
+          <w:numId w:val="1"/>
+        </w:numPr>
+        <w:spacing w:lineRule="auto" w:line="230" w:before="10" w:after="10"/>
+        <w:rPr/>
+      </w:pPr>
+      <w:r>
+        <w:rPr>
+          <w:rFonts w:eastAsia="Cambria" w:cs="Cambria"/>
+          <w:sz w:val="19"/>
+          <w:szCs w:val="19"/>
+        </w:rPr>
+        <w:t>Kept the published numbers honest with 175 tests and a CI gate that fails the build when a metric moves.</w:t>
+      </w:r>
+    </w:p>
+    <w:p>
+      <w:pPr>
+        <w:pStyle w:val="Normal"/>
+        <w:tabs>
+          <w:tab w:val="clear" w:pos="720"/>
+          <w:tab w:val="right" w:pos="10800" w:leader="none"/>
+        </w:tabs>
+        <w:spacing w:before="90" w:after="0"/>
+        <w:rPr/>
+      </w:pPr>
+      <w:r>
+        <w:rPr>
+          <w:rFonts w:eastAsia="Cambria" w:cs="Cambria"/>
+          <w:sz w:val="19"/>
+          <w:szCs w:val="19"/>
+          <w:b/>
+          <w:bCs/>
+        </w:rPr>
+        <w:t>FitFileSize</w:t>
+      </w:r>
+      <w:r>
+        <w:rPr>
+          <w:rFonts w:eastAsia="Cambria" w:cs="Cambria"/>
+          <w:sz w:val="19"/>
+          <w:szCs w:val="19"/>
+        </w:rPr>
+        <w:tab/>
+      </w:r>
       <w:hyperlink r:id="rId104">
+        <w:r>
+          <w:rPr>
+            <w:rStyle w:val="Style3"/>
+            <w:rFonts w:eastAsia="Cambria" w:cs="Cambria"/>
+            <w:color w:val="000000"/>
+            <w:sz w:val="19"/>
+            <w:szCs w:val="19"/>
+            <w:u w:val="single"/>
+          </w:rPr>
+          <w:t>Live</w:t>
+        </w:r>
+      </w:hyperlink>
+      <w:r>
+        <w:rPr>
+          <w:rFonts w:eastAsia="Cambria" w:cs="Cambria"/>
+          <w:sz w:val="19"/>
+          <w:szCs w:val="19"/>
+        </w:rPr>
+        <w:t xml:space="preserve"> | </w:t>
+      </w:r>
+      <w:hyperlink r:id="rId105">
         <w:r>
           <w:rPr>
             <w:rStyle w:val="Style3"/>
@@ -640,7 +755,7 @@
           <w:i/>
           <w:iCs/>
         </w:rPr>
-        <w:t>Python, PyTorch, Qwen2.5-VL, Transformers, Pydantic, FastAPI, Docker, GitHub Actions</w:t>
+        <w:t>Python, FastAPI, Redis/RQ, React, TypeScript, Docker, Cloudflare Tunnel, Ghostscript, MCP</w:t>
       </w:r>
     </w:p>
     <w:p>
@@ -659,7 +774,7 @@
           <w:sz w:val="19"/>
           <w:szCs w:val="19"/>
         </w:rPr>
-        <w:t>Built a local document extraction service that reads invoices and receipts into typed JSON and scores its own confidence on every field, lifting delivered accuracy from 80% to 97% by sending only the fields it does not trust to a human.</w:t>
+        <w:t>Solo-built and launched a web app, public API, and MCP server that compress PDFs and images (7 formats, including iPhone HEIC) to fit an upload limit or a form’s exact rules, such as visa photos and exam uploads.</w:t>
       </w:r>
     </w:p>
     <w:p>
@@ -678,7 +793,26 @@
           <w:sz w:val="19"/>
           <w:szCs w:val="19"/>
         </w:rPr>
-        <w:t>Kept the published numbers honest with 175 tests and a CI gate that fails the build when a metric moves.</w:t>
+        <w:t>Designed an async job pipeline (FastAPI, Redis/RQ workers, Server-Sent Events) with format-specific logic behind one strategy interface, self-hosted with Docker on a VPS behind a Cloudflare Tunnel with deploy-on-merge.</w:t>
+      </w:r>
+    </w:p>
+    <w:p>
+      <w:pPr>
+        <w:pStyle w:val="ListParagraph"/>
+        <w:numPr>
+          <w:ilvl w:val="0"/>
+          <w:numId w:val="1"/>
+        </w:numPr>
+        <w:spacing w:lineRule="auto" w:line="230" w:before="10" w:after="10"/>
+        <w:rPr/>
+      </w:pPr>
+      <w:r>
+        <w:rPr>
+          <w:rFonts w:eastAsia="Cambria" w:cs="Cambria"/>
+          <w:sz w:val="19"/>
+          <w:szCs w:val="19"/>
+        </w:rPr>
+        <w:t>Made production runs over 2x faster with a guided search that predicts the best quality setting, and cut the slowest run from 31 s to 11.5 s with zero quality regressions across 197 validation runs; ~300 tests in CI.</w:t>
       </w:r>
     </w:p>
     <w:p>
@@ -699,7 +833,7 @@
           <w:b/>
           <w:bCs/>
         </w:rPr>
-        <w:t>FitFileSize</w:t>
+        <w:t>Cairn</w:t>
       </w:r>
       <w:r>
         <w:rPr>
@@ -709,7 +843,7 @@
         </w:rPr>
         <w:tab/>
       </w:r>
-      <w:hyperlink r:id="rId105">
+      <w:hyperlink r:id="rId106">
         <w:r>
           <w:rPr>
             <w:rStyle w:val="Style3"/>
@@ -730,7 +864,7 @@
         </w:rPr>
         <w:t xml:space="preserve"> | </w:t>
       </w:r>
-      <w:hyperlink r:id="rId106">
+      <w:hyperlink r:id="rId107">
         <w:r>
           <w:rPr>
             <w:rStyle w:val="Style3"/>
@@ -776,7 +910,7 @@
           <w:i/>
           <w:iCs/>
         </w:rPr>
-        <w:t>Python, FastAPI, Redis/RQ, React, TypeScript, Docker, Cloudflare Tunnel, Ghostscript, MCP</w:t>
+        <w:t>Rust, AWS Lambda, DynamoDB, CloudFront, API Gateway, Terraform</w:t>
       </w:r>
     </w:p>
     <w:p>
@@ -795,7 +929,7 @@
           <w:sz w:val="19"/>
           <w:szCs w:val="19"/>
         </w:rPr>
-        <w:t>Solo-built and launched a web app, public API, and MCP server that compress PDFs and images (7 formats, including iPhone HEIC) to fit an upload limit or a form’s exact rules, such as visa photos and exam uploads.</w:t>
+        <w:t>Built the ingest path as a Rust binary on ARM64 AWS Lambda that responds in 5.1 ms warm and 184 ms cold, doing one DynamoDB write per event and deferring every dimension derivation.</w:t>
       </w:r>
     </w:p>
     <w:p>
@@ -814,26 +948,7 @@
           <w:sz w:val="19"/>
           <w:szCs w:val="19"/>
         </w:rPr>
-        <w:t>Designed an async job pipeline (FastAPI, Redis/RQ workers, Server-Sent Events) with format-specific logic behind one strategy interface, self-hosted with Docker on a VPS behind a Cloudflare Tunnel with deploy-on-merge.</w:t>
-      </w:r>
-    </w:p>
-    <w:p>
-      <w:pPr>
-        <w:pStyle w:val="ListParagraph"/>
-        <w:numPr>
-          <w:ilvl w:val="0"/>
-          <w:numId w:val="1"/>
-        </w:numPr>
-        <w:spacing w:lineRule="auto" w:line="230" w:before="10" w:after="10"/>
-        <w:rPr/>
-      </w:pPr>
-      <w:r>
-        <w:rPr>
-          <w:rFonts w:eastAsia="Cambria" w:cs="Cambria"/>
-          <w:sz w:val="19"/>
-          <w:szCs w:val="19"/>
-        </w:rPr>
-        <w:t>Made production runs over 2x faster with a guided search that predicts the best quality setting, and cut the slowest run from 31 s to 11.5 s with zero quality regressions across 197 validation runs; ~300 tests in CI.</w:t>
+        <w:t>Deployed the full stack of Lambda, DynamoDB, CloudFront, and API Gateway as 41 Terraform managed resources running live across three sites at zero steady-state cost and made the service cookie-free by hashing visitor identifiers under a key that rotates daily.</w:t>
       </w:r>
     </w:p>
     <w:p>
@@ -854,7 +969,7 @@
           <w:b/>
           <w:bCs/>
         </w:rPr>
-        <w:t>Cairn</w:t>
+        <w:t>The Almanac (Capstone)</w:t>
       </w:r>
       <w:r>
         <w:rPr>
@@ -863,27 +978,6 @@
           <w:szCs w:val="19"/>
         </w:rPr>
         <w:tab/>
-      </w:r>
-      <w:hyperlink r:id="rId107">
-        <w:r>
-          <w:rPr>
-            <w:rStyle w:val="Style3"/>
-            <w:rFonts w:eastAsia="Cambria" w:cs="Cambria"/>
-            <w:color w:val="000000"/>
-            <w:sz w:val="19"/>
-            <w:szCs w:val="19"/>
-            <w:u w:val="single"/>
-          </w:rPr>
-          <w:t>Live</w:t>
-        </w:r>
-      </w:hyperlink>
-      <w:r>
-        <w:rPr>
-          <w:rFonts w:eastAsia="Cambria" w:cs="Cambria"/>
-          <w:sz w:val="19"/>
-          <w:szCs w:val="19"/>
-        </w:rPr>
-        <w:t xml:space="preserve"> | </w:t>
       </w:r>
       <w:hyperlink r:id="rId108">
         <w:r>
@@ -914,7 +1008,7 @@
           <w:i/>
           <w:iCs/>
         </w:rPr>
-        <w:t>2026</w:t>
+        <w:t>2025</w:t>
       </w:r>
     </w:p>
     <w:p>
@@ -931,7 +1025,7 @@
           <w:i/>
           <w:iCs/>
         </w:rPr>
-        <w:t>Rust, AWS Lambda, DynamoDB, CloudFront, API Gateway, Terraform</w:t>
+        <w:t>Python, Azure Data Factory, Databricks, PySpark, Azure SQL, PyTorch, Django REST, Flutter</w:t>
       </w:r>
     </w:p>
     <w:p>
@@ -950,121 +1044,6 @@
           <w:sz w:val="19"/>
           <w:szCs w:val="19"/>
         </w:rPr>
-        <w:t>Built the ingest path as a Rust binary on ARM64 AWS Lambda that responds in 5.1 ms warm and 184 ms cold, doing one DynamoDB write per event and deferring every dimension derivation.</w:t>
-      </w:r>
-    </w:p>
-    <w:p>
-      <w:pPr>
-        <w:pStyle w:val="ListParagraph"/>
-        <w:numPr>
-          <w:ilvl w:val="0"/>
-          <w:numId w:val="1"/>
-        </w:numPr>
-        <w:spacing w:lineRule="auto" w:line="230" w:before="10" w:after="10"/>
-        <w:rPr/>
-      </w:pPr>
-      <w:r>
-        <w:rPr>
-          <w:rFonts w:eastAsia="Cambria" w:cs="Cambria"/>
-          <w:sz w:val="19"/>
-          <w:szCs w:val="19"/>
-        </w:rPr>
-        <w:t>Deployed the full stack of Lambda, DynamoDB, CloudFront, and API Gateway as 41 Terraform managed resources running live across three sites at zero steady-state cost and made the service cookie-free by hashing visitor identifiers under a key that rotates daily.</w:t>
-      </w:r>
-    </w:p>
-    <w:p>
-      <w:pPr>
-        <w:pStyle w:val="Normal"/>
-        <w:tabs>
-          <w:tab w:val="clear" w:pos="720"/>
-          <w:tab w:val="right" w:pos="10800" w:leader="none"/>
-        </w:tabs>
-        <w:spacing w:before="90" w:after="0"/>
-        <w:rPr/>
-      </w:pPr>
-      <w:r>
-        <w:rPr>
-          <w:rFonts w:eastAsia="Cambria" w:cs="Cambria"/>
-          <w:sz w:val="19"/>
-          <w:szCs w:val="19"/>
-          <w:b/>
-          <w:bCs/>
-        </w:rPr>
-        <w:t>The Almanac (Capstone)</w:t>
-      </w:r>
-      <w:r>
-        <w:rPr>
-          <w:rFonts w:eastAsia="Cambria" w:cs="Cambria"/>
-          <w:sz w:val="19"/>
-          <w:szCs w:val="19"/>
-        </w:rPr>
-        <w:tab/>
-      </w:r>
-      <w:hyperlink r:id="rId109">
-        <w:r>
-          <w:rPr>
-            <w:rStyle w:val="Style3"/>
-            <w:rFonts w:eastAsia="Cambria" w:cs="Cambria"/>
-            <w:color w:val="000000"/>
-            <w:sz w:val="19"/>
-            <w:szCs w:val="19"/>
-            <w:u w:val="single"/>
-          </w:rPr>
-          <w:t>GitHub</w:t>
-        </w:r>
-      </w:hyperlink>
-      <w:r>
-        <w:rPr>
-          <w:rFonts w:eastAsia="Cambria" w:cs="Cambria"/>
-          <w:sz w:val="19"/>
-          <w:szCs w:val="19"/>
-        </w:rPr>
-        <w:t xml:space="preserve"> | </w:t>
-      </w:r>
-      <w:r>
-        <w:rPr>
-          <w:rFonts w:eastAsia="Cambria" w:cs="Cambria"/>
-          <w:sz w:val="19"/>
-          <w:szCs w:val="19"/>
-          <w:i/>
-          <w:iCs/>
-        </w:rPr>
-        <w:t>2025</w:t>
-      </w:r>
-    </w:p>
-    <w:p>
-      <w:pPr>
-        <w:pStyle w:val="Normal"/>
-        <w:spacing w:before="0" w:after="10"/>
-        <w:rPr/>
-      </w:pPr>
-      <w:r>
-        <w:rPr>
-          <w:rFonts w:eastAsia="Cambria" w:cs="Cambria"/>
-          <w:sz w:val="19"/>
-          <w:szCs w:val="19"/>
-          <w:i/>
-          <w:iCs/>
-        </w:rPr>
-        <w:t>Python, Azure Data Factory, Databricks, PySpark, Azure SQL, PyTorch, Django REST, Flutter</w:t>
-      </w:r>
-    </w:p>
-    <w:p>
-      <w:pPr>
-        <w:pStyle w:val="ListParagraph"/>
-        <w:numPr>
-          <w:ilvl w:val="0"/>
-          <w:numId w:val="1"/>
-        </w:numPr>
-        <w:spacing w:lineRule="auto" w:line="230" w:before="10" w:after="10"/>
-        <w:rPr/>
-      </w:pPr>
-      <w:r>
-        <w:rPr>
-          <w:rFonts w:eastAsia="Cambria" w:cs="Cambria"/>
-          <w:sz w:val="19"/>
-          <w:szCs w:val="19"/>
-        </w:rPr>
         <w:t>Redesigned the storage layer of an automated market-data pipeline behind a stock-tracking web and mobile app, improving data load performance by ~35%; shipped with a team over eight months.</w:t>
       </w:r>
     </w:p>
@@ -1117,7 +1096,7 @@
         </w:rPr>
         <w:tab/>
       </w:r>
-      <w:hyperlink r:id="rId110">
+      <w:hyperlink r:id="rId109">
         <w:r>
           <w:rPr>
             <w:rStyle w:val="Style3"/>

</xml_diff>

<commit_message>
Pin line spacing so Word and LibreOffice lay the page out alike
The .docx ran to two pages in Word while rendering as one here. The
cause was auto line spacing, which multiplies the FONT's own line
height. Caladea, which this box substitutes for Cambria, matches
Cambria's advance widths but not its line height, so Word inflated all
55 lines and nothing in a LibreOffice render could reveal it.

Every paragraph now carries exact leading in twips, so line height no
longer depends on which font resolves: 10.7pt body, 12.6pt headings.
Paragraph gaps come down with it.

That leaves wrap points as the only font-dependent variable, and
Caladea is width-compatible with Cambria by design, so they should
agree. The page now carries 26pt of slack, about 2.4 lines, which
absorbs a couple of wraps if they do not.

Co-Authored-By: Claude Opus 5 <noreply@anthropic.com>
Claude-Session: https://claude.ai/code/session_01TZMtrvddzvMq5oVEMCKpau
</commit_message>
<xml_diff>
--- a/GautamSingh_Resume.docx
+++ b/GautamSingh_Resume.docx
@@ -5,7 +5,7 @@
     <w:p>
       <w:pPr>
         <w:pStyle w:val="Normal"/>
-        <w:spacing w:before="0" w:after="20"/>
+        <w:spacing w:lineRule="exact" w:line="510" w:before="0" w:after="20"/>
         <w:jc w:val="center"/>
         <w:rPr/>
       </w:pPr>
@@ -24,7 +24,7 @@
     <w:p>
       <w:pPr>
         <w:pStyle w:val="Normal"/>
-        <w:spacing w:before="0" w:after="40"/>
+        <w:spacing w:lineRule="exact" w:line="214" w:before="0" w:after="40"/>
         <w:jc w:val="center"/>
         <w:rPr/>
       </w:pPr>
@@ -40,7 +40,7 @@
     <w:p>
       <w:pPr>
         <w:pStyle w:val="Normal"/>
-        <w:spacing w:before="0" w:after="40"/>
+        <w:spacing w:lineRule="exact" w:line="214" w:before="0" w:after="40"/>
         <w:jc w:val="center"/>
         <w:rPr/>
       </w:pPr>
@@ -143,7 +143,7 @@
         <w:pBdr>
           <w:bottom w:val="single" w:sz="6" w:space="1" w:color="000000"/>
         </w:pBdr>
-        <w:spacing w:before="120" w:after="30"/>
+        <w:spacing w:lineRule="exact" w:line="252" w:before="88" w:after="20"/>
         <w:rPr/>
       </w:pPr>
       <w:r>
@@ -161,7 +161,7 @@
     <w:p>
       <w:pPr>
         <w:pStyle w:val="Normal"/>
-        <w:spacing w:before="18" w:after="0"/>
+        <w:spacing w:lineRule="exact" w:line="214" w:before="18" w:after="0"/>
         <w:rPr/>
       </w:pPr>
       <w:r>
@@ -186,7 +186,7 @@
     <w:p>
       <w:pPr>
         <w:pStyle w:val="Normal"/>
-        <w:spacing w:before="18" w:after="0"/>
+        <w:spacing w:lineRule="exact" w:line="214" w:before="18" w:after="0"/>
         <w:rPr/>
       </w:pPr>
       <w:r>
@@ -211,7 +211,7 @@
     <w:p>
       <w:pPr>
         <w:pStyle w:val="Normal"/>
-        <w:spacing w:before="18" w:after="0"/>
+        <w:spacing w:lineRule="exact" w:line="214" w:before="18" w:after="0"/>
         <w:rPr/>
       </w:pPr>
       <w:r>
@@ -236,7 +236,7 @@
     <w:p>
       <w:pPr>
         <w:pStyle w:val="Normal"/>
-        <w:spacing w:before="18" w:after="0"/>
+        <w:spacing w:lineRule="exact" w:line="214" w:before="18" w:after="0"/>
         <w:rPr/>
       </w:pPr>
       <w:r>
@@ -264,7 +264,7 @@
         <w:pBdr>
           <w:bottom w:val="single" w:sz="6" w:space="1" w:color="000000"/>
         </w:pBdr>
-        <w:spacing w:before="120" w:after="30"/>
+        <w:spacing w:lineRule="exact" w:line="252" w:before="88" w:after="20"/>
         <w:rPr/>
       </w:pPr>
       <w:r>
@@ -286,7 +286,7 @@
           <w:tab w:val="clear" w:pos="720"/>
           <w:tab w:val="right" w:pos="10800" w:leader="none"/>
         </w:tabs>
-        <w:spacing w:before="50" w:after="0"/>
+        <w:spacing w:lineRule="exact" w:line="214" w:before="36" w:after="0"/>
         <w:rPr/>
       </w:pPr>
       <w:r>
@@ -323,7 +323,7 @@
           <w:tab w:val="clear" w:pos="720"/>
           <w:tab w:val="right" w:pos="10800" w:leader="none"/>
         </w:tabs>
-        <w:spacing w:before="50" w:after="0"/>
+        <w:spacing w:lineRule="exact" w:line="214" w:before="36" w:after="0"/>
         <w:rPr/>
       </w:pPr>
       <w:r>
@@ -362,7 +362,7 @@
           <w:ilvl w:val="0"/>
           <w:numId w:val="1"/>
         </w:numPr>
-        <w:spacing w:lineRule="auto" w:line="230" w:before="10" w:after="10"/>
+        <w:spacing w:lineRule="exact" w:line="214" w:before="6" w:after="6"/>
         <w:rPr/>
       </w:pPr>
       <w:r>
@@ -381,7 +381,7 @@
           <w:ilvl w:val="0"/>
           <w:numId w:val="1"/>
         </w:numPr>
-        <w:spacing w:lineRule="auto" w:line="230" w:before="10" w:after="10"/>
+        <w:spacing w:lineRule="exact" w:line="214" w:before="6" w:after="6"/>
         <w:rPr/>
       </w:pPr>
       <w:r>
@@ -400,7 +400,7 @@
           <w:ilvl w:val="0"/>
           <w:numId w:val="1"/>
         </w:numPr>
-        <w:spacing w:lineRule="auto" w:line="230" w:before="10" w:after="10"/>
+        <w:spacing w:lineRule="exact" w:line="214" w:before="6" w:after="6"/>
         <w:rPr/>
       </w:pPr>
       <w:r>
@@ -419,7 +419,7 @@
           <w:ilvl w:val="0"/>
           <w:numId w:val="1"/>
         </w:numPr>
-        <w:spacing w:lineRule="auto" w:line="230" w:before="10" w:after="10"/>
+        <w:spacing w:lineRule="exact" w:line="214" w:before="6" w:after="6"/>
         <w:rPr/>
       </w:pPr>
       <w:r>
@@ -438,7 +438,7 @@
           <w:tab w:val="clear" w:pos="720"/>
           <w:tab w:val="right" w:pos="10800" w:leader="none"/>
         </w:tabs>
-        <w:spacing w:before="50" w:after="0"/>
+        <w:spacing w:lineRule="exact" w:line="214" w:before="36" w:after="0"/>
         <w:rPr/>
       </w:pPr>
       <w:r>
@@ -475,7 +475,7 @@
           <w:tab w:val="clear" w:pos="720"/>
           <w:tab w:val="right" w:pos="10800" w:leader="none"/>
         </w:tabs>
-        <w:spacing w:before="50" w:after="0"/>
+        <w:spacing w:lineRule="exact" w:line="214" w:before="36" w:after="0"/>
         <w:rPr/>
       </w:pPr>
       <w:r>
@@ -514,7 +514,7 @@
           <w:ilvl w:val="0"/>
           <w:numId w:val="1"/>
         </w:numPr>
-        <w:spacing w:lineRule="auto" w:line="230" w:before="10" w:after="10"/>
+        <w:spacing w:lineRule="exact" w:line="214" w:before="6" w:after="6"/>
         <w:rPr/>
       </w:pPr>
       <w:r>
@@ -533,7 +533,7 @@
           <w:ilvl w:val="0"/>
           <w:numId w:val="1"/>
         </w:numPr>
-        <w:spacing w:lineRule="auto" w:line="230" w:before="10" w:after="10"/>
+        <w:spacing w:lineRule="exact" w:line="214" w:before="6" w:after="6"/>
         <w:rPr/>
       </w:pPr>
       <w:r>
@@ -551,7 +551,7 @@
         <w:pBdr>
           <w:bottom w:val="single" w:sz="6" w:space="1" w:color="000000"/>
         </w:pBdr>
-        <w:spacing w:before="120" w:after="30"/>
+        <w:spacing w:lineRule="exact" w:line="252" w:before="88" w:after="20"/>
         <w:rPr/>
       </w:pPr>
       <w:r>
@@ -573,7 +573,7 @@
           <w:tab w:val="clear" w:pos="720"/>
           <w:tab w:val="right" w:pos="10800" w:leader="none"/>
         </w:tabs>
-        <w:spacing w:before="90" w:after="0"/>
+        <w:spacing w:lineRule="exact" w:line="214" w:before="60" w:after="0"/>
         <w:rPr/>
       </w:pPr>
       <w:r>
@@ -608,7 +608,7 @@
     <w:p>
       <w:pPr>
         <w:pStyle w:val="Normal"/>
-        <w:spacing w:before="0" w:after="10"/>
+        <w:spacing w:lineRule="exact" w:line="214" w:before="0" w:after="6"/>
         <w:rPr/>
       </w:pPr>
       <w:r>
@@ -629,7 +629,7 @@
           <w:ilvl w:val="0"/>
           <w:numId w:val="1"/>
         </w:numPr>
-        <w:spacing w:lineRule="auto" w:line="230" w:before="10" w:after="10"/>
+        <w:spacing w:lineRule="exact" w:line="214" w:before="6" w:after="6"/>
         <w:rPr/>
       </w:pPr>
       <w:r>
@@ -648,7 +648,7 @@
           <w:ilvl w:val="0"/>
           <w:numId w:val="1"/>
         </w:numPr>
-        <w:spacing w:lineRule="auto" w:line="230" w:before="10" w:after="10"/>
+        <w:spacing w:lineRule="exact" w:line="214" w:before="6" w:after="6"/>
         <w:rPr/>
       </w:pPr>
       <w:r>
@@ -667,7 +667,7 @@
           <w:tab w:val="clear" w:pos="720"/>
           <w:tab w:val="right" w:pos="10800" w:leader="none"/>
         </w:tabs>
-        <w:spacing w:before="90" w:after="0"/>
+        <w:spacing w:lineRule="exact" w:line="214" w:before="60" w:after="0"/>
         <w:rPr/>
       </w:pPr>
       <w:r>
@@ -744,7 +744,7 @@
     <w:p>
       <w:pPr>
         <w:pStyle w:val="Normal"/>
-        <w:spacing w:before="0" w:after="10"/>
+        <w:spacing w:lineRule="exact" w:line="214" w:before="0" w:after="6"/>
         <w:rPr/>
       </w:pPr>
       <w:r>
@@ -765,7 +765,7 @@
           <w:ilvl w:val="0"/>
           <w:numId w:val="1"/>
         </w:numPr>
-        <w:spacing w:lineRule="auto" w:line="230" w:before="10" w:after="10"/>
+        <w:spacing w:lineRule="exact" w:line="214" w:before="6" w:after="6"/>
         <w:rPr/>
       </w:pPr>
       <w:r>
@@ -784,7 +784,7 @@
           <w:ilvl w:val="0"/>
           <w:numId w:val="1"/>
         </w:numPr>
-        <w:spacing w:lineRule="auto" w:line="230" w:before="10" w:after="10"/>
+        <w:spacing w:lineRule="exact" w:line="214" w:before="6" w:after="6"/>
         <w:rPr/>
       </w:pPr>
       <w:r>
@@ -803,7 +803,7 @@
           <w:ilvl w:val="0"/>
           <w:numId w:val="1"/>
         </w:numPr>
-        <w:spacing w:lineRule="auto" w:line="230" w:before="10" w:after="10"/>
+        <w:spacing w:lineRule="exact" w:line="214" w:before="6" w:after="6"/>
         <w:rPr/>
       </w:pPr>
       <w:r>
@@ -822,7 +822,7 @@
           <w:tab w:val="clear" w:pos="720"/>
           <w:tab w:val="right" w:pos="10800" w:leader="none"/>
         </w:tabs>
-        <w:spacing w:before="90" w:after="0"/>
+        <w:spacing w:lineRule="exact" w:line="214" w:before="60" w:after="0"/>
         <w:rPr/>
       </w:pPr>
       <w:r>
@@ -899,7 +899,7 @@
     <w:p>
       <w:pPr>
         <w:pStyle w:val="Normal"/>
-        <w:spacing w:before="0" w:after="10"/>
+        <w:spacing w:lineRule="exact" w:line="214" w:before="0" w:after="6"/>
         <w:rPr/>
       </w:pPr>
       <w:r>
@@ -920,7 +920,7 @@
           <w:ilvl w:val="0"/>
           <w:numId w:val="1"/>
         </w:numPr>
-        <w:spacing w:lineRule="auto" w:line="230" w:before="10" w:after="10"/>
+        <w:spacing w:lineRule="exact" w:line="214" w:before="6" w:after="6"/>
         <w:rPr/>
       </w:pPr>
       <w:r>
@@ -939,7 +939,7 @@
           <w:ilvl w:val="0"/>
           <w:numId w:val="1"/>
         </w:numPr>
-        <w:spacing w:lineRule="auto" w:line="230" w:before="10" w:after="10"/>
+        <w:spacing w:lineRule="exact" w:line="214" w:before="6" w:after="6"/>
         <w:rPr/>
       </w:pPr>
       <w:r>
@@ -958,7 +958,7 @@
           <w:tab w:val="clear" w:pos="720"/>
           <w:tab w:val="right" w:pos="10800" w:leader="none"/>
         </w:tabs>
-        <w:spacing w:before="90" w:after="0"/>
+        <w:spacing w:lineRule="exact" w:line="214" w:before="60" w:after="0"/>
         <w:rPr/>
       </w:pPr>
       <w:r>
@@ -1014,7 +1014,7 @@
     <w:p>
       <w:pPr>
         <w:pStyle w:val="Normal"/>
-        <w:spacing w:before="0" w:after="10"/>
+        <w:spacing w:lineRule="exact" w:line="214" w:before="0" w:after="6"/>
         <w:rPr/>
       </w:pPr>
       <w:r>
@@ -1035,7 +1035,7 @@
           <w:ilvl w:val="0"/>
           <w:numId w:val="1"/>
         </w:numPr>
-        <w:spacing w:lineRule="auto" w:line="230" w:before="10" w:after="10"/>
+        <w:spacing w:lineRule="exact" w:line="214" w:before="6" w:after="6"/>
         <w:rPr/>
       </w:pPr>
       <w:r>
@@ -1053,7 +1053,7 @@
         <w:pBdr>
           <w:bottom w:val="single" w:sz="6" w:space="1" w:color="000000"/>
         </w:pBdr>
-        <w:spacing w:before="120" w:after="30"/>
+        <w:spacing w:lineRule="exact" w:line="252" w:before="88" w:after="20"/>
         <w:rPr/>
       </w:pPr>
       <w:r>
@@ -1075,7 +1075,7 @@
           <w:tab w:val="clear" w:pos="720"/>
           <w:tab w:val="right" w:pos="10800" w:leader="none"/>
         </w:tabs>
-        <w:spacing w:before="90" w:after="0"/>
+        <w:spacing w:lineRule="exact" w:line="214" w:before="60" w:after="0"/>
         <w:rPr/>
       </w:pPr>
       <w:r>
@@ -1135,7 +1135,7 @@
           <w:ilvl w:val="0"/>
           <w:numId w:val="1"/>
         </w:numPr>
-        <w:spacing w:lineRule="auto" w:line="230" w:before="10" w:after="10"/>
+        <w:spacing w:lineRule="exact" w:line="214" w:before="6" w:after="6"/>
         <w:rPr/>
       </w:pPr>
       <w:r>
@@ -1153,7 +1153,7 @@
         <w:pBdr>
           <w:bottom w:val="single" w:sz="6" w:space="1" w:color="000000"/>
         </w:pBdr>
-        <w:spacing w:before="120" w:after="30"/>
+        <w:spacing w:lineRule="exact" w:line="252" w:before="88" w:after="20"/>
         <w:rPr/>
       </w:pPr>
       <w:r>
@@ -1175,7 +1175,7 @@
           <w:tab w:val="clear" w:pos="720"/>
           <w:tab w:val="right" w:pos="10800" w:leader="none"/>
         </w:tabs>
-        <w:spacing w:before="50" w:after="0"/>
+        <w:spacing w:lineRule="exact" w:line="214" w:before="36" w:after="0"/>
         <w:rPr/>
       </w:pPr>
       <w:r>
@@ -1212,7 +1212,7 @@
           <w:tab w:val="clear" w:pos="720"/>
           <w:tab w:val="right" w:pos="10800" w:leader="none"/>
         </w:tabs>
-        <w:spacing w:before="50" w:after="0"/>
+        <w:spacing w:lineRule="exact" w:line="214" w:before="36" w:after="0"/>
         <w:rPr/>
       </w:pPr>
       <w:r>
@@ -1251,7 +1251,7 @@
           <w:tab w:val="clear" w:pos="720"/>
           <w:tab w:val="right" w:pos="10800" w:leader="none"/>
         </w:tabs>
-        <w:spacing w:before="50" w:after="0"/>
+        <w:spacing w:lineRule="exact" w:line="214" w:before="36" w:after="0"/>
         <w:rPr/>
       </w:pPr>
       <w:r>

</xml_diff>